<commit_message>
Informe S3: coeficientes beta de los 3 modelos y OR en unidades reales
</commit_message>
<xml_diff>
--- a/docs/informe_sumativa3_grupo2.docx
+++ b/docs/informe_sumativa3_grupo2.docx
@@ -307,7 +307,7 @@
       </w:r>
     </w:p>
     <w:p>
-      <w:hyperlink w:history="1" r:id="rIdkpuezyyautfmqj1wbsgsb">
+      <w:hyperlink w:history="1" r:id="rIdhdzq-vushmkm5-b3iqu26">
         <w:r>
           <w:rPr>
             <w:rStyle w:val="Hyperlink"/>
@@ -490,7 +490,7 @@
           <w:sz w:val="18"/>
           <w:szCs w:val="18"/>
         </w:rPr>
-        <w:t xml:space="preserve">	6</w:t>
+        <w:t xml:space="preserve">	7</w:t>
       </w:r>
     </w:p>
     <w:p>
@@ -534,7 +534,7 @@
           <w:sz w:val="18"/>
           <w:szCs w:val="18"/>
         </w:rPr>
-        <w:t xml:space="preserve">	7</w:t>
+        <w:t xml:space="preserve">	8</w:t>
       </w:r>
     </w:p>
     <w:p>
@@ -4519,7 +4519,7 @@
                 <w:sz w:val="16"/>
                 <w:szCs w:val="16"/>
               </w:rPr>
-              <w:t xml:space="preserve">Variable (OR por 1 DE)</w:t>
+              <w:t xml:space="preserve">Variable</w:t>
             </w:r>
           </w:p>
         </w:tc>
@@ -4654,7 +4654,7 @@
                 <w:sz w:val="16"/>
                 <w:szCs w:val="16"/>
               </w:rPr>
-              <w:t xml:space="preserve">ExitRates</w:t>
+              <w:t xml:space="preserve">Intercepto</w:t>
             </w:r>
           </w:p>
         </w:tc>
@@ -4685,7 +4685,21 @@
                 <w:sz w:val="16"/>
                 <w:szCs w:val="16"/>
               </w:rPr>
-              <w:t xml:space="preserve">0,211 (0,185–0,242)</w:t>
+              <w:t xml:space="preserve">β = −0,206</w:t>
+            </w:r>
+          </w:p>
+          <w:p>
+            <w:pPr>
+              <w:keepNext/>
+              <w:keepLines/>
+              <w:jc w:val="center"/>
+            </w:pPr>
+            <w:r>
+              <w:rPr>
+                <w:sz w:val="16"/>
+                <w:szCs w:val="16"/>
+              </w:rPr>
+              <w:t xml:space="preserve">OR 0,813 (0,710–0,932)</w:t>
             </w:r>
           </w:p>
         </w:tc>
@@ -4716,7 +4730,21 @@
                 <w:sz w:val="16"/>
                 <w:szCs w:val="16"/>
               </w:rPr>
-              <w:t xml:space="preserve">0,231 (0,202–0,264)</w:t>
+              <w:t xml:space="preserve">β = −0,226</w:t>
+            </w:r>
+          </w:p>
+          <w:p>
+            <w:pPr>
+              <w:keepNext/>
+              <w:keepLines/>
+              <w:jc w:val="center"/>
+            </w:pPr>
+            <w:r>
+              <w:rPr>
+                <w:sz w:val="16"/>
+                <w:szCs w:val="16"/>
+              </w:rPr>
+              <w:t xml:space="preserve">OR 0,797 (0,697–0,912)</w:t>
             </w:r>
           </w:p>
         </w:tc>
@@ -4747,7 +4775,21 @@
                 <w:sz w:val="16"/>
                 <w:szCs w:val="16"/>
               </w:rPr>
-              <w:t xml:space="preserve">0,230 (0,201–0,263)</w:t>
+              <w:t xml:space="preserve">β = −0,206</w:t>
+            </w:r>
+          </w:p>
+          <w:p>
+            <w:pPr>
+              <w:keepNext/>
+              <w:keepLines/>
+              <w:jc w:val="center"/>
+            </w:pPr>
+            <w:r>
+              <w:rPr>
+                <w:sz w:val="16"/>
+                <w:szCs w:val="16"/>
+              </w:rPr>
+              <w:t xml:space="preserve">OR 0,813 (0,713–0,928)</w:t>
             </w:r>
           </w:p>
         </w:tc>
@@ -4780,7 +4822,7 @@
                 <w:sz w:val="16"/>
                 <w:szCs w:val="16"/>
               </w:rPr>
-              <w:t xml:space="preserve">ProductRelated_Duration</w:t>
+              <w:t xml:space="preserve">ExitRates (por 1 DE)</w:t>
             </w:r>
           </w:p>
         </w:tc>
@@ -4811,7 +4853,21 @@
                 <w:sz w:val="16"/>
                 <w:szCs w:val="16"/>
               </w:rPr>
-              <w:t xml:space="preserve">1,330 (1,258–1,406)</w:t>
+              <w:t xml:space="preserve">β = −1,554</w:t>
+            </w:r>
+          </w:p>
+          <w:p>
+            <w:pPr>
+              <w:keepNext/>
+              <w:keepLines/>
+              <w:jc w:val="center"/>
+            </w:pPr>
+            <w:r>
+              <w:rPr>
+                <w:sz w:val="16"/>
+                <w:szCs w:val="16"/>
+              </w:rPr>
+              <w:t xml:space="preserve">OR 0,211 (0,185–0,242)</w:t>
             </w:r>
           </w:p>
         </w:tc>
@@ -4842,7 +4898,21 @@
                 <w:sz w:val="16"/>
                 <w:szCs w:val="16"/>
               </w:rPr>
-              <w:t xml:space="preserve">1,260 (1,187–1,337)</w:t>
+              <w:t xml:space="preserve">β = −1,465</w:t>
+            </w:r>
+          </w:p>
+          <w:p>
+            <w:pPr>
+              <w:keepNext/>
+              <w:keepLines/>
+              <w:jc w:val="center"/>
+            </w:pPr>
+            <w:r>
+              <w:rPr>
+                <w:sz w:val="16"/>
+                <w:szCs w:val="16"/>
+              </w:rPr>
+              <w:t xml:space="preserve">OR 0,231 (0,202–0,264)</w:t>
             </w:r>
           </w:p>
         </w:tc>
@@ -4873,7 +4943,21 @@
                 <w:sz w:val="16"/>
                 <w:szCs w:val="16"/>
               </w:rPr>
-              <w:t xml:space="preserve">1,275 (1,203–1,352)</w:t>
+              <w:t xml:space="preserve">β = −1,469</w:t>
+            </w:r>
+          </w:p>
+          <w:p>
+            <w:pPr>
+              <w:keepNext/>
+              <w:keepLines/>
+              <w:jc w:val="center"/>
+            </w:pPr>
+            <w:r>
+              <w:rPr>
+                <w:sz w:val="16"/>
+                <w:szCs w:val="16"/>
+              </w:rPr>
+              <w:t xml:space="preserve">OR 0,230 (0,201–0,263)</w:t>
             </w:r>
           </w:p>
         </w:tc>
@@ -4906,7 +4990,7 @@
                 <w:sz w:val="16"/>
                 <w:szCs w:val="16"/>
               </w:rPr>
-              <w:t xml:space="preserve">Visitante recurrente (vs nuevo)</w:t>
+              <w:t xml:space="preserve">ProductRelated_Duration (por 1 DE)</w:t>
             </w:r>
           </w:p>
         </w:tc>
@@ -4937,7 +5021,21 @@
                 <w:sz w:val="16"/>
                 <w:szCs w:val="16"/>
               </w:rPr>
-              <w:t xml:space="preserve">0,652 (0,574–0,740)</w:t>
+              <w:t xml:space="preserve">β = 0,285</w:t>
+            </w:r>
+          </w:p>
+          <w:p>
+            <w:pPr>
+              <w:keepNext/>
+              <w:keepLines/>
+              <w:jc w:val="center"/>
+            </w:pPr>
+            <w:r>
+              <w:rPr>
+                <w:sz w:val="16"/>
+                <w:szCs w:val="16"/>
+              </w:rPr>
+              <w:t xml:space="preserve">OR 1,330 (1,258–1,406)</w:t>
             </w:r>
           </w:p>
         </w:tc>
@@ -4968,7 +5066,21 @@
                 <w:sz w:val="16"/>
                 <w:szCs w:val="16"/>
               </w:rPr>
-              <w:t xml:space="preserve">0,662 (0,584–0,751)</w:t>
+              <w:t xml:space="preserve">β = 0,231</w:t>
+            </w:r>
+          </w:p>
+          <w:p>
+            <w:pPr>
+              <w:keepNext/>
+              <w:keepLines/>
+              <w:jc w:val="center"/>
+            </w:pPr>
+            <w:r>
+              <w:rPr>
+                <w:sz w:val="16"/>
+                <w:szCs w:val="16"/>
+              </w:rPr>
+              <w:t xml:space="preserve">OR 1,260 (1,187–1,337)</w:t>
             </w:r>
           </w:p>
         </w:tc>
@@ -4999,7 +5111,21 @@
                 <w:sz w:val="16"/>
                 <w:szCs w:val="16"/>
               </w:rPr>
-              <w:t xml:space="preserve">0,667 (0,588–0,756)</w:t>
+              <w:t xml:space="preserve">β = 0,243</w:t>
+            </w:r>
+          </w:p>
+          <w:p>
+            <w:pPr>
+              <w:keepNext/>
+              <w:keepLines/>
+              <w:jc w:val="center"/>
+            </w:pPr>
+            <w:r>
+              <w:rPr>
+                <w:sz w:val="16"/>
+                <w:szCs w:val="16"/>
+              </w:rPr>
+              <w:t xml:space="preserve">OR 1,275 (1,203–1,352)</w:t>
             </w:r>
           </w:p>
         </w:tc>
@@ -5032,7 +5158,7 @@
                 <w:sz w:val="16"/>
                 <w:szCs w:val="16"/>
               </w:rPr>
-              <w:t xml:space="preserve">Visitante “Other” (vs nuevo)</w:t>
+              <w:t xml:space="preserve">Visitante recurrente (vs nuevo)</w:t>
             </w:r>
           </w:p>
         </w:tc>
@@ -5063,7 +5189,21 @@
                 <w:sz w:val="16"/>
                 <w:szCs w:val="16"/>
               </w:rPr>
-              <w:t xml:space="preserve">0,997 (0,568–1,748)†</w:t>
+              <w:t xml:space="preserve">β = −0,428</w:t>
+            </w:r>
+          </w:p>
+          <w:p>
+            <w:pPr>
+              <w:keepNext/>
+              <w:keepLines/>
+              <w:jc w:val="center"/>
+            </w:pPr>
+            <w:r>
+              <w:rPr>
+                <w:sz w:val="16"/>
+                <w:szCs w:val="16"/>
+              </w:rPr>
+              <w:t xml:space="preserve">OR 0,652 (0,574–0,740)</w:t>
             </w:r>
           </w:p>
         </w:tc>
@@ -5094,7 +5234,21 @@
                 <w:sz w:val="16"/>
                 <w:szCs w:val="16"/>
               </w:rPr>
-              <w:t xml:space="preserve">—</w:t>
+              <w:t xml:space="preserve">β = −0,412</w:t>
+            </w:r>
+          </w:p>
+          <w:p>
+            <w:pPr>
+              <w:keepNext/>
+              <w:keepLines/>
+              <w:jc w:val="center"/>
+            </w:pPr>
+            <w:r>
+              <w:rPr>
+                <w:sz w:val="16"/>
+                <w:szCs w:val="16"/>
+              </w:rPr>
+              <w:t xml:space="preserve">OR 0,662 (0,584–0,751)</w:t>
             </w:r>
           </w:p>
         </w:tc>
@@ -5125,7 +5279,21 @@
                 <w:sz w:val="16"/>
                 <w:szCs w:val="16"/>
               </w:rPr>
-              <w:t xml:space="preserve">—</w:t>
+              <w:t xml:space="preserve">β = −0,405</w:t>
+            </w:r>
+          </w:p>
+          <w:p>
+            <w:pPr>
+              <w:keepNext/>
+              <w:keepLines/>
+              <w:jc w:val="center"/>
+            </w:pPr>
+            <w:r>
+              <w:rPr>
+                <w:sz w:val="16"/>
+                <w:szCs w:val="16"/>
+              </w:rPr>
+              <w:t xml:space="preserve">OR 0,667 (0,588–0,756)</w:t>
             </w:r>
           </w:p>
         </w:tc>
@@ -5158,7 +5326,7 @@
                 <w:sz w:val="16"/>
                 <w:szCs w:val="16"/>
               </w:rPr>
-              <w:t xml:space="preserve">Weekend</w:t>
+              <w:t xml:space="preserve">Visitante “Other” (vs nuevo)</w:t>
             </w:r>
           </w:p>
         </w:tc>
@@ -5189,7 +5357,21 @@
                 <w:sz w:val="16"/>
                 <w:szCs w:val="16"/>
               </w:rPr>
-              <w:t xml:space="preserve">1,130 (1,015–1,258)</w:t>
+              <w:t xml:space="preserve">β = −0,003</w:t>
+            </w:r>
+          </w:p>
+          <w:p>
+            <w:pPr>
+              <w:keepNext/>
+              <w:keepLines/>
+              <w:jc w:val="center"/>
+            </w:pPr>
+            <w:r>
+              <w:rPr>
+                <w:sz w:val="16"/>
+                <w:szCs w:val="16"/>
+              </w:rPr>
+              <w:t xml:space="preserve">OR 0,997 (0,568–1,748)†</w:t>
             </w:r>
           </w:p>
         </w:tc>
@@ -5220,7 +5402,7 @@
                 <w:sz w:val="16"/>
                 <w:szCs w:val="16"/>
               </w:rPr>
-              <w:t xml:space="preserve">1,116 (1,002–1,243)</w:t>
+              <w:t xml:space="preserve">—</w:t>
             </w:r>
           </w:p>
         </w:tc>
@@ -5284,7 +5466,7 @@
                 <w:sz w:val="16"/>
                 <w:szCs w:val="16"/>
               </w:rPr>
-              <w:t xml:space="preserve">SpecialDay</w:t>
+              <w:t xml:space="preserve">Weekend (vs día hábil)</w:t>
             </w:r>
           </w:p>
         </w:tc>
@@ -5315,69 +5497,97 @@
                 <w:sz w:val="16"/>
                 <w:szCs w:val="16"/>
               </w:rPr>
+              <w:t xml:space="preserve">β = 0,122</w:t>
+            </w:r>
+          </w:p>
+          <w:p>
+            <w:pPr>
+              <w:keepNext/>
+              <w:keepLines/>
+              <w:jc w:val="center"/>
+            </w:pPr>
+            <w:r>
+              <w:rPr>
+                <w:sz w:val="16"/>
+                <w:szCs w:val="16"/>
+              </w:rPr>
+              <w:t xml:space="preserve">OR 1,130 (1,015–1,258)</w:t>
+            </w:r>
+          </w:p>
+        </w:tc>
+        <w:tc>
+          <w:tcPr>
+            <w:tcW w:type="dxa" w:w="2300"/>
+            <w:tcBorders>
+              <w:top w:val="single" w:color="B4C6E7" w:sz="4"/>
+              <w:left w:val="single" w:color="B4C6E7" w:sz="4"/>
+              <w:bottom w:val="single" w:color="B4C6E7" w:sz="4"/>
+              <w:right w:val="single" w:color="B4C6E7" w:sz="4"/>
+            </w:tcBorders>
+            <w:tcMar>
+              <w:top w:type="dxa" w:w="30"/>
+              <w:left w:type="dxa" w:w="70"/>
+              <w:bottom w:type="dxa" w:w="30"/>
+              <w:right w:type="dxa" w:w="70"/>
+            </w:tcMar>
+          </w:tcPr>
+          <w:p>
+            <w:pPr>
+              <w:keepNext/>
+              <w:keepLines/>
+              <w:jc w:val="center"/>
+            </w:pPr>
+            <w:r>
+              <w:rPr>
+                <w:sz w:val="16"/>
+                <w:szCs w:val="16"/>
+              </w:rPr>
+              <w:t xml:space="preserve">β = 0,110</w:t>
+            </w:r>
+          </w:p>
+          <w:p>
+            <w:pPr>
+              <w:keepNext/>
+              <w:keepLines/>
+              <w:jc w:val="center"/>
+            </w:pPr>
+            <w:r>
+              <w:rPr>
+                <w:sz w:val="16"/>
+                <w:szCs w:val="16"/>
+              </w:rPr>
+              <w:t xml:space="preserve">OR 1,116 (1,002–1,243)</w:t>
+            </w:r>
+          </w:p>
+        </w:tc>
+        <w:tc>
+          <w:tcPr>
+            <w:tcW w:type="dxa" w:w="2300"/>
+            <w:tcBorders>
+              <w:top w:val="single" w:color="B4C6E7" w:sz="4"/>
+              <w:left w:val="single" w:color="B4C6E7" w:sz="4"/>
+              <w:bottom w:val="single" w:color="B4C6E7" w:sz="4"/>
+              <w:right w:val="single" w:color="B4C6E7" w:sz="4"/>
+            </w:tcBorders>
+            <w:tcMar>
+              <w:top w:type="dxa" w:w="30"/>
+              <w:left w:type="dxa" w:w="70"/>
+              <w:bottom w:type="dxa" w:w="30"/>
+              <w:right w:type="dxa" w:w="70"/>
+            </w:tcMar>
+          </w:tcPr>
+          <w:p>
+            <w:pPr>
+              <w:keepNext/>
+              <w:keepLines/>
+              <w:jc w:val="center"/>
+            </w:pPr>
+            <w:r>
+              <w:rPr>
+                <w:sz w:val="16"/>
+                <w:szCs w:val="16"/>
+              </w:rPr>
               <w:t xml:space="preserve">—</w:t>
-            </w:r>
-          </w:p>
-        </w:tc>
-        <w:tc>
-          <w:tcPr>
-            <w:tcW w:type="dxa" w:w="2300"/>
-            <w:tcBorders>
-              <w:top w:val="single" w:color="B4C6E7" w:sz="4"/>
-              <w:left w:val="single" w:color="B4C6E7" w:sz="4"/>
-              <w:bottom w:val="single" w:color="B4C6E7" w:sz="4"/>
-              <w:right w:val="single" w:color="B4C6E7" w:sz="4"/>
-            </w:tcBorders>
-            <w:tcMar>
-              <w:top w:type="dxa" w:w="30"/>
-              <w:left w:type="dxa" w:w="70"/>
-              <w:bottom w:type="dxa" w:w="30"/>
-              <w:right w:type="dxa" w:w="70"/>
-            </w:tcMar>
-          </w:tcPr>
-          <w:p>
-            <w:pPr>
-              <w:keepNext/>
-              <w:keepLines/>
-              <w:jc w:val="center"/>
-            </w:pPr>
-            <w:r>
-              <w:rPr>
-                <w:sz w:val="16"/>
-                <w:szCs w:val="16"/>
-              </w:rPr>
-              <w:t xml:space="preserve">0,766 (0,718–0,818)</w:t>
-            </w:r>
-          </w:p>
-        </w:tc>
-        <w:tc>
-          <w:tcPr>
-            <w:tcW w:type="dxa" w:w="2300"/>
-            <w:tcBorders>
-              <w:top w:val="single" w:color="B4C6E7" w:sz="4"/>
-              <w:left w:val="single" w:color="B4C6E7" w:sz="4"/>
-              <w:bottom w:val="single" w:color="B4C6E7" w:sz="4"/>
-              <w:right w:val="single" w:color="B4C6E7" w:sz="4"/>
-            </w:tcBorders>
-            <w:tcMar>
-              <w:top w:type="dxa" w:w="30"/>
-              <w:left w:type="dxa" w:w="70"/>
-              <w:bottom w:type="dxa" w:w="30"/>
-              <w:right w:type="dxa" w:w="70"/>
-            </w:tcMar>
-          </w:tcPr>
-          <w:p>
-            <w:pPr>
-              <w:keepNext/>
-              <w:keepLines/>
-              <w:jc w:val="center"/>
-            </w:pPr>
-            <w:r>
-              <w:rPr>
-                <w:sz w:val="16"/>
-                <w:szCs w:val="16"/>
-              </w:rPr>
-              <w:t xml:space="preserve">0,764 (0,715–0,815)</w:t>
             </w:r>
           </w:p>
         </w:tc>
@@ -5410,7 +5620,7 @@
                 <w:sz w:val="16"/>
                 <w:szCs w:val="16"/>
               </w:rPr>
-              <w:t xml:space="preserve">Administrative</w:t>
+              <w:t xml:space="preserve">SpecialDay (por 1 DE)</w:t>
             </w:r>
           </w:p>
         </w:tc>
@@ -5472,7 +5682,21 @@
                 <w:sz w:val="16"/>
                 <w:szCs w:val="16"/>
               </w:rPr>
-              <w:t xml:space="preserve">1,080 (1,028–1,135)</w:t>
+              <w:t xml:space="preserve">β = −0,266</w:t>
+            </w:r>
+          </w:p>
+          <w:p>
+            <w:pPr>
+              <w:keepNext/>
+              <w:keepLines/>
+              <w:jc w:val="center"/>
+            </w:pPr>
+            <w:r>
+              <w:rPr>
+                <w:sz w:val="16"/>
+                <w:szCs w:val="16"/>
+              </w:rPr>
+              <w:t xml:space="preserve">OR 0,766 (0,718–0,818)</w:t>
             </w:r>
           </w:p>
         </w:tc>
@@ -5503,7 +5727,21 @@
                 <w:sz w:val="16"/>
                 <w:szCs w:val="16"/>
               </w:rPr>
-              <w:t xml:space="preserve">1,094 (1,042–1,148)</w:t>
+              <w:t xml:space="preserve">β = −0,270</w:t>
+            </w:r>
+          </w:p>
+          <w:p>
+            <w:pPr>
+              <w:keepNext/>
+              <w:keepLines/>
+              <w:jc w:val="center"/>
+            </w:pPr>
+            <w:r>
+              <w:rPr>
+                <w:sz w:val="16"/>
+                <w:szCs w:val="16"/>
+              </w:rPr>
+              <w:t xml:space="preserve">OR 0,764 (0,715–0,815)</w:t>
             </w:r>
           </w:p>
         </w:tc>
@@ -5536,7 +5774,7 @@
                 <w:sz w:val="16"/>
                 <w:szCs w:val="16"/>
               </w:rPr>
-              <w:t xml:space="preserve">Informational</w:t>
+              <w:t xml:space="preserve">Administrative (por 1 DE)</w:t>
             </w:r>
           </w:p>
         </w:tc>
@@ -5598,7 +5836,175 @@
                 <w:sz w:val="16"/>
                 <w:szCs w:val="16"/>
               </w:rPr>
-              <w:t xml:space="preserve">1,050 (1,000–1,102)†</w:t>
+              <w:t xml:space="preserve">β = 0,077</w:t>
+            </w:r>
+          </w:p>
+          <w:p>
+            <w:pPr>
+              <w:keepNext/>
+              <w:keepLines/>
+              <w:jc w:val="center"/>
+            </w:pPr>
+            <w:r>
+              <w:rPr>
+                <w:sz w:val="16"/>
+                <w:szCs w:val="16"/>
+              </w:rPr>
+              <w:t xml:space="preserve">OR 1,080 (1,028–1,135)</w:t>
+            </w:r>
+          </w:p>
+        </w:tc>
+        <w:tc>
+          <w:tcPr>
+            <w:tcW w:type="dxa" w:w="2300"/>
+            <w:tcBorders>
+              <w:top w:val="single" w:color="B4C6E7" w:sz="4"/>
+              <w:left w:val="single" w:color="B4C6E7" w:sz="4"/>
+              <w:bottom w:val="single" w:color="B4C6E7" w:sz="4"/>
+              <w:right w:val="single" w:color="B4C6E7" w:sz="4"/>
+            </w:tcBorders>
+            <w:tcMar>
+              <w:top w:type="dxa" w:w="30"/>
+              <w:left w:type="dxa" w:w="70"/>
+              <w:bottom w:type="dxa" w:w="30"/>
+              <w:right w:type="dxa" w:w="70"/>
+            </w:tcMar>
+          </w:tcPr>
+          <w:p>
+            <w:pPr>
+              <w:keepNext/>
+              <w:keepLines/>
+              <w:jc w:val="center"/>
+            </w:pPr>
+            <w:r>
+              <w:rPr>
+                <w:sz w:val="16"/>
+                <w:szCs w:val="16"/>
+              </w:rPr>
+              <w:t xml:space="preserve">β = 0,090</w:t>
+            </w:r>
+          </w:p>
+          <w:p>
+            <w:pPr>
+              <w:keepNext/>
+              <w:keepLines/>
+              <w:jc w:val="center"/>
+            </w:pPr>
+            <w:r>
+              <w:rPr>
+                <w:sz w:val="16"/>
+                <w:szCs w:val="16"/>
+              </w:rPr>
+              <w:t xml:space="preserve">OR 1,094 (1,042–1,148)</w:t>
+            </w:r>
+          </w:p>
+        </w:tc>
+      </w:tr>
+      <w:tr>
+        <w:tc>
+          <w:tcPr>
+            <w:tcW w:type="dxa" w:w="3072"/>
+            <w:tcBorders>
+              <w:top w:val="single" w:color="B4C6E7" w:sz="4"/>
+              <w:left w:val="single" w:color="B4C6E7" w:sz="4"/>
+              <w:bottom w:val="single" w:color="B4C6E7" w:sz="4"/>
+              <w:right w:val="single" w:color="B4C6E7" w:sz="4"/>
+            </w:tcBorders>
+            <w:tcMar>
+              <w:top w:type="dxa" w:w="30"/>
+              <w:left w:type="dxa" w:w="70"/>
+              <w:bottom w:type="dxa" w:w="30"/>
+              <w:right w:type="dxa" w:w="70"/>
+            </w:tcMar>
+          </w:tcPr>
+          <w:p>
+            <w:pPr>
+              <w:keepNext/>
+              <w:keepLines/>
+              <w:jc w:val="left"/>
+            </w:pPr>
+            <w:r>
+              <w:rPr>
+                <w:sz w:val="16"/>
+                <w:szCs w:val="16"/>
+              </w:rPr>
+              <w:t xml:space="preserve">Informational (por 1 DE)</w:t>
+            </w:r>
+          </w:p>
+        </w:tc>
+        <w:tc>
+          <w:tcPr>
+            <w:tcW w:type="dxa" w:w="2300"/>
+            <w:tcBorders>
+              <w:top w:val="single" w:color="B4C6E7" w:sz="4"/>
+              <w:left w:val="single" w:color="B4C6E7" w:sz="4"/>
+              <w:bottom w:val="single" w:color="B4C6E7" w:sz="4"/>
+              <w:right w:val="single" w:color="B4C6E7" w:sz="4"/>
+            </w:tcBorders>
+            <w:tcMar>
+              <w:top w:type="dxa" w:w="30"/>
+              <w:left w:type="dxa" w:w="70"/>
+              <w:bottom w:type="dxa" w:w="30"/>
+              <w:right w:type="dxa" w:w="70"/>
+            </w:tcMar>
+          </w:tcPr>
+          <w:p>
+            <w:pPr>
+              <w:keepNext/>
+              <w:keepLines/>
+              <w:jc w:val="center"/>
+            </w:pPr>
+            <w:r>
+              <w:rPr>
+                <w:sz w:val="16"/>
+                <w:szCs w:val="16"/>
+              </w:rPr>
+              <w:t xml:space="preserve">—</w:t>
+            </w:r>
+          </w:p>
+        </w:tc>
+        <w:tc>
+          <w:tcPr>
+            <w:tcW w:type="dxa" w:w="2300"/>
+            <w:tcBorders>
+              <w:top w:val="single" w:color="B4C6E7" w:sz="4"/>
+              <w:left w:val="single" w:color="B4C6E7" w:sz="4"/>
+              <w:bottom w:val="single" w:color="B4C6E7" w:sz="4"/>
+              <w:right w:val="single" w:color="B4C6E7" w:sz="4"/>
+            </w:tcBorders>
+            <w:tcMar>
+              <w:top w:type="dxa" w:w="30"/>
+              <w:left w:type="dxa" w:w="70"/>
+              <w:bottom w:type="dxa" w:w="30"/>
+              <w:right w:type="dxa" w:w="70"/>
+            </w:tcMar>
+          </w:tcPr>
+          <w:p>
+            <w:pPr>
+              <w:keepNext/>
+              <w:keepLines/>
+              <w:jc w:val="center"/>
+            </w:pPr>
+            <w:r>
+              <w:rPr>
+                <w:sz w:val="16"/>
+                <w:szCs w:val="16"/>
+              </w:rPr>
+              <w:t xml:space="preserve">β = 0,048</w:t>
+            </w:r>
+          </w:p>
+          <w:p>
+            <w:pPr>
+              <w:keepNext/>
+              <w:keepLines/>
+              <w:jc w:val="center"/>
+            </w:pPr>
+            <w:r>
+              <w:rPr>
+                <w:sz w:val="16"/>
+                <w:szCs w:val="16"/>
+              </w:rPr>
+              <w:t xml:space="preserve">OR 1,050 (1,000–1,102)†</w:t>
             </w:r>
           </w:p>
         </w:tc>
@@ -5648,7 +6054,7 @@
           <w:sz w:val="17"/>
           <w:szCs w:val="17"/>
         </w:rPr>
-        <w:t xml:space="preserve">Tabla 5. Odds ratios (IC 95 % tradicional) de los tres modelos ponderados. † = no significativo al 5 % (p = 0,991 y p = 0,051).</w:t>
+        <w:t xml:space="preserve">Tabla 5. Coeficientes estimados (β) y odds ratios con IC 95 % tradicional de los tres modelos ponderados. † = no significativo al 5 % (p = 0,991 y p = 0,051).</w:t>
       </w:r>
     </w:p>
     <w:p>
@@ -8618,6 +9024,15 @@
         <w:jc w:val="both"/>
       </w:pPr>
       <w:r>
+        <w:t xml:space="preserve">Para leer los OR en unidades reales: 1 DE equivale a 0,048 en ExitRates (≈ 5 puntos porcentuales más de tasa de salida), 1.898 s (≈ 32 minutos) en ProductRelated_Duration, 3,3 páginas administrativas y 0,20 en SpecialDay; visitante recurrente se compara con visitante nuevo.</w:t>
+      </w:r>
+    </w:p>
+    <w:p>
+      <w:pPr>
+        <w:spacing w:after="100" w:line="252"/>
+        <w:jc w:val="both"/>
+      </w:pPr>
+      <w:r>
         <w:t xml:space="preserve">Manteniendo constantes las demás variables, y como asociación: una DE más de </w:t>
       </w:r>
       <w:r>
@@ -10036,7 +10451,7 @@
           <w:sz w:val="17"/>
           <w:szCs w:val="17"/>
         </w:rPr>
-        <w:t xml:space="preserve">Figura 2. Comparación de IC 95 % tradicional y bootstrap de los odds ratios (escala logarítmica).</w:t>
+        <w:t xml:space="preserve">Figura 2. Comparación de IC 95 % tradicional y bootstrap de los odds ratios (escala logarítmica; variables numéricas por 1 DE, visitante recurrente frente a nuevo).</w:t>
       </w:r>
     </w:p>
     <w:p>

</xml_diff>